<commit_message>
H. PERTANYAAN ANALISIS, I. OUTPUT YANG DIHARAPKAN
</commit_message>
<xml_diff>
--- a/Laporan/03_Ahmad Dzul Fadhli Jobsheet 15,16&17.docx
+++ b/Laporan/03_Ahmad Dzul Fadhli Jobsheet 15,16&17.docx
@@ -5286,10 +5286,1316 @@
       </w:r>
     </w:p>
     <w:p/>
+    <w:p>
+      <w:pPr>
+        <w:pStyle w:val="Heading2"/>
+        <w:rPr>
+          <w:lang w:val="en-ID"/>
+        </w:rPr>
+      </w:pPr>
+      <w:r>
+        <w:rPr>
+          <w:lang w:val="en-ID"/>
+        </w:rPr>
+        <w:t xml:space="preserve">H. </w:t>
+      </w:r>
+      <w:proofErr w:type="spellStart"/>
+      <w:r>
+        <w:rPr>
+          <w:lang w:val="en-ID"/>
+        </w:rPr>
+        <w:t>Pertanyaan</w:t>
+      </w:r>
+      <w:proofErr w:type="spellEnd"/>
+      <w:r>
+        <w:rPr>
+          <w:lang w:val="en-ID"/>
+        </w:rPr>
+        <w:t xml:space="preserve"> </w:t>
+      </w:r>
+      <w:proofErr w:type="spellStart"/>
+      <w:r>
+        <w:rPr>
+          <w:lang w:val="en-ID"/>
+        </w:rPr>
+        <w:t>Analisis</w:t>
+      </w:r>
+      <w:proofErr w:type="spellEnd"/>
+    </w:p>
+    <w:p>
+      <w:pPr>
+        <w:rPr>
+          <w:lang w:val="en-ID"/>
+        </w:rPr>
+      </w:pPr>
+      <w:r>
+        <w:rPr>
+          <w:lang w:val="en-ID"/>
+        </w:rPr>
+        <w:t xml:space="preserve">1. </w:t>
+      </w:r>
+      <w:proofErr w:type="spellStart"/>
+      <w:r>
+        <w:rPr>
+          <w:lang w:val="en-ID"/>
+        </w:rPr>
+        <w:t>Mengapa</w:t>
+      </w:r>
+      <w:proofErr w:type="spellEnd"/>
+      <w:r>
+        <w:rPr>
+          <w:lang w:val="en-ID"/>
+        </w:rPr>
+        <w:t xml:space="preserve"> password </w:t>
+      </w:r>
+      <w:proofErr w:type="spellStart"/>
+      <w:r>
+        <w:rPr>
+          <w:lang w:val="en-ID"/>
+        </w:rPr>
+        <w:t>harus</w:t>
+      </w:r>
+      <w:proofErr w:type="spellEnd"/>
+      <w:r>
+        <w:rPr>
+          <w:lang w:val="en-ID"/>
+        </w:rPr>
+        <w:t xml:space="preserve"> di-hash?</w:t>
+      </w:r>
+    </w:p>
+    <w:p>
+      <w:pPr>
+        <w:rPr>
+          <w:u w:val="single"/>
+          <w:lang w:val="en-ID"/>
+        </w:rPr>
+      </w:pPr>
+      <w:r>
+        <w:rPr>
+          <w:u w:val="single"/>
+        </w:rPr>
+        <w:t xml:space="preserve">Agar password </w:t>
+      </w:r>
+      <w:proofErr w:type="spellStart"/>
+      <w:r>
+        <w:rPr>
+          <w:u w:val="single"/>
+        </w:rPr>
+        <w:t>tersimpan</w:t>
+      </w:r>
+      <w:proofErr w:type="spellEnd"/>
+      <w:r>
+        <w:rPr>
+          <w:u w:val="single"/>
+        </w:rPr>
+        <w:t xml:space="preserve"> </w:t>
+      </w:r>
+      <w:proofErr w:type="spellStart"/>
+      <w:r>
+        <w:rPr>
+          <w:u w:val="single"/>
+        </w:rPr>
+        <w:t>aman</w:t>
+      </w:r>
+      <w:proofErr w:type="spellEnd"/>
+      <w:r>
+        <w:rPr>
+          <w:u w:val="single"/>
+        </w:rPr>
+        <w:t xml:space="preserve"> dan </w:t>
+      </w:r>
+      <w:proofErr w:type="spellStart"/>
+      <w:r>
+        <w:rPr>
+          <w:u w:val="single"/>
+        </w:rPr>
+        <w:t>tidak</w:t>
+      </w:r>
+      <w:proofErr w:type="spellEnd"/>
+      <w:r>
+        <w:rPr>
+          <w:u w:val="single"/>
+        </w:rPr>
+        <w:t xml:space="preserve"> </w:t>
+      </w:r>
+      <w:proofErr w:type="spellStart"/>
+      <w:r>
+        <w:rPr>
+          <w:u w:val="single"/>
+        </w:rPr>
+        <w:t>dapat</w:t>
+      </w:r>
+      <w:proofErr w:type="spellEnd"/>
+      <w:r>
+        <w:rPr>
+          <w:u w:val="single"/>
+        </w:rPr>
+        <w:t xml:space="preserve"> </w:t>
+      </w:r>
+      <w:proofErr w:type="spellStart"/>
+      <w:r>
+        <w:rPr>
+          <w:u w:val="single"/>
+        </w:rPr>
+        <w:t>dibaca</w:t>
+      </w:r>
+      <w:proofErr w:type="spellEnd"/>
+      <w:r>
+        <w:rPr>
+          <w:u w:val="single"/>
+        </w:rPr>
+        <w:t xml:space="preserve"> </w:t>
+      </w:r>
+      <w:proofErr w:type="spellStart"/>
+      <w:r>
+        <w:rPr>
+          <w:u w:val="single"/>
+        </w:rPr>
+        <w:t>langsung</w:t>
+      </w:r>
+      <w:proofErr w:type="spellEnd"/>
+      <w:r>
+        <w:rPr>
+          <w:u w:val="single"/>
+        </w:rPr>
+        <w:t xml:space="preserve"> </w:t>
+      </w:r>
+      <w:proofErr w:type="spellStart"/>
+      <w:r>
+        <w:rPr>
+          <w:u w:val="single"/>
+        </w:rPr>
+        <w:t>jika</w:t>
+      </w:r>
+      <w:proofErr w:type="spellEnd"/>
+      <w:r>
+        <w:rPr>
+          <w:u w:val="single"/>
+        </w:rPr>
+        <w:t xml:space="preserve"> database bocor.</w:t>
+      </w:r>
+    </w:p>
+    <w:p>
+      <w:pPr>
+        <w:rPr>
+          <w:lang w:val="en-ID"/>
+        </w:rPr>
+      </w:pPr>
+      <w:r>
+        <w:rPr>
+          <w:lang w:val="en-ID"/>
+        </w:rPr>
+        <w:t xml:space="preserve">2. Apa </w:t>
+      </w:r>
+      <w:proofErr w:type="spellStart"/>
+      <w:r>
+        <w:rPr>
+          <w:lang w:val="en-ID"/>
+        </w:rPr>
+        <w:t>perbedaan</w:t>
+      </w:r>
+      <w:proofErr w:type="spellEnd"/>
+      <w:r>
+        <w:rPr>
+          <w:lang w:val="en-ID"/>
+        </w:rPr>
+        <w:t xml:space="preserve"> </w:t>
+      </w:r>
+      <w:proofErr w:type="spellStart"/>
+      <w:r>
+        <w:rPr>
+          <w:lang w:val="en-ID"/>
+        </w:rPr>
+        <w:t>addDoc</w:t>
+      </w:r>
+      <w:proofErr w:type="spellEnd"/>
+      <w:r>
+        <w:rPr>
+          <w:lang w:val="en-ID"/>
+        </w:rPr>
+        <w:t xml:space="preserve"> dan </w:t>
+      </w:r>
+      <w:proofErr w:type="spellStart"/>
+      <w:r>
+        <w:rPr>
+          <w:lang w:val="en-ID"/>
+        </w:rPr>
+        <w:t>setDoc</w:t>
+      </w:r>
+      <w:proofErr w:type="spellEnd"/>
+      <w:r>
+        <w:rPr>
+          <w:lang w:val="en-ID"/>
+        </w:rPr>
+        <w:t>?</w:t>
+      </w:r>
+    </w:p>
+    <w:p>
+      <w:pPr>
+        <w:rPr>
+          <w:u w:val="single"/>
+          <w:lang w:val="en-ID"/>
+        </w:rPr>
+      </w:pPr>
+      <w:proofErr w:type="spellStart"/>
+      <w:r>
+        <w:rPr>
+          <w:u w:val="single"/>
+        </w:rPr>
+        <w:t>addDoc</w:t>
+      </w:r>
+      <w:proofErr w:type="spellEnd"/>
+      <w:r>
+        <w:rPr>
+          <w:u w:val="single"/>
+        </w:rPr>
+        <w:t xml:space="preserve"> </w:t>
+      </w:r>
+      <w:proofErr w:type="spellStart"/>
+      <w:r>
+        <w:rPr>
+          <w:u w:val="single"/>
+        </w:rPr>
+        <w:t>membuat</w:t>
+      </w:r>
+      <w:proofErr w:type="spellEnd"/>
+      <w:r>
+        <w:rPr>
+          <w:u w:val="single"/>
+        </w:rPr>
+        <w:t xml:space="preserve"> </w:t>
+      </w:r>
+      <w:proofErr w:type="spellStart"/>
+      <w:r>
+        <w:rPr>
+          <w:u w:val="single"/>
+        </w:rPr>
+        <w:t>dokumen</w:t>
+      </w:r>
+      <w:proofErr w:type="spellEnd"/>
+      <w:r>
+        <w:rPr>
+          <w:u w:val="single"/>
+        </w:rPr>
+        <w:t xml:space="preserve"> </w:t>
+      </w:r>
+      <w:proofErr w:type="spellStart"/>
+      <w:r>
+        <w:rPr>
+          <w:u w:val="single"/>
+        </w:rPr>
+        <w:t>baru</w:t>
+      </w:r>
+      <w:proofErr w:type="spellEnd"/>
+      <w:r>
+        <w:rPr>
+          <w:u w:val="single"/>
+        </w:rPr>
+        <w:t xml:space="preserve"> </w:t>
+      </w:r>
+      <w:proofErr w:type="spellStart"/>
+      <w:r>
+        <w:rPr>
+          <w:u w:val="single"/>
+        </w:rPr>
+        <w:t>dengan</w:t>
+      </w:r>
+      <w:proofErr w:type="spellEnd"/>
+      <w:r>
+        <w:rPr>
+          <w:u w:val="single"/>
+        </w:rPr>
+        <w:t xml:space="preserve"> ID </w:t>
+      </w:r>
+      <w:proofErr w:type="spellStart"/>
+      <w:r>
+        <w:rPr>
+          <w:u w:val="single"/>
+        </w:rPr>
+        <w:t>otomatis</w:t>
+      </w:r>
+      <w:proofErr w:type="spellEnd"/>
+      <w:r>
+        <w:rPr>
+          <w:u w:val="single"/>
+        </w:rPr>
+        <w:t xml:space="preserve">, </w:t>
+      </w:r>
+      <w:proofErr w:type="spellStart"/>
+      <w:r>
+        <w:rPr>
+          <w:u w:val="single"/>
+        </w:rPr>
+        <w:t>sedangkan</w:t>
+      </w:r>
+      <w:proofErr w:type="spellEnd"/>
+      <w:r>
+        <w:rPr>
+          <w:u w:val="single"/>
+        </w:rPr>
+        <w:t xml:space="preserve"> </w:t>
+      </w:r>
+      <w:proofErr w:type="spellStart"/>
+      <w:r>
+        <w:rPr>
+          <w:u w:val="single"/>
+        </w:rPr>
+        <w:t>setDoc</w:t>
+      </w:r>
+      <w:proofErr w:type="spellEnd"/>
+      <w:r>
+        <w:rPr>
+          <w:u w:val="single"/>
+        </w:rPr>
+        <w:t xml:space="preserve"> </w:t>
+      </w:r>
+      <w:proofErr w:type="spellStart"/>
+      <w:r>
+        <w:rPr>
+          <w:u w:val="single"/>
+        </w:rPr>
+        <w:t>membuat</w:t>
+      </w:r>
+      <w:proofErr w:type="spellEnd"/>
+      <w:r>
+        <w:rPr>
+          <w:u w:val="single"/>
+        </w:rPr>
+        <w:t xml:space="preserve"> </w:t>
+      </w:r>
+      <w:proofErr w:type="spellStart"/>
+      <w:r>
+        <w:rPr>
+          <w:u w:val="single"/>
+        </w:rPr>
+        <w:t>atau</w:t>
+      </w:r>
+      <w:proofErr w:type="spellEnd"/>
+      <w:r>
+        <w:rPr>
+          <w:u w:val="single"/>
+        </w:rPr>
+        <w:t xml:space="preserve"> </w:t>
+      </w:r>
+      <w:proofErr w:type="spellStart"/>
+      <w:r>
+        <w:rPr>
+          <w:u w:val="single"/>
+        </w:rPr>
+        <w:t>menimpa</w:t>
+      </w:r>
+      <w:proofErr w:type="spellEnd"/>
+      <w:r>
+        <w:rPr>
+          <w:u w:val="single"/>
+        </w:rPr>
+        <w:t xml:space="preserve"> </w:t>
+      </w:r>
+      <w:proofErr w:type="spellStart"/>
+      <w:r>
+        <w:rPr>
+          <w:u w:val="single"/>
+        </w:rPr>
+        <w:t>dokumen</w:t>
+      </w:r>
+      <w:proofErr w:type="spellEnd"/>
+      <w:r>
+        <w:rPr>
+          <w:u w:val="single"/>
+        </w:rPr>
+        <w:t xml:space="preserve"> </w:t>
+      </w:r>
+      <w:proofErr w:type="spellStart"/>
+      <w:r>
+        <w:rPr>
+          <w:u w:val="single"/>
+        </w:rPr>
+        <w:t>dengan</w:t>
+      </w:r>
+      <w:proofErr w:type="spellEnd"/>
+      <w:r>
+        <w:rPr>
+          <w:u w:val="single"/>
+        </w:rPr>
+        <w:t xml:space="preserve"> ID yang </w:t>
+      </w:r>
+      <w:proofErr w:type="spellStart"/>
+      <w:r>
+        <w:rPr>
+          <w:u w:val="single"/>
+        </w:rPr>
+        <w:t>ditentukan</w:t>
+      </w:r>
+      <w:proofErr w:type="spellEnd"/>
+      <w:r>
+        <w:rPr>
+          <w:u w:val="single"/>
+        </w:rPr>
+        <w:t>.</w:t>
+      </w:r>
+    </w:p>
+    <w:p>
+      <w:pPr>
+        <w:rPr>
+          <w:lang w:val="en-ID"/>
+        </w:rPr>
+      </w:pPr>
+      <w:r>
+        <w:rPr>
+          <w:lang w:val="en-ID"/>
+        </w:rPr>
+        <w:t xml:space="preserve">3. </w:t>
+      </w:r>
+      <w:proofErr w:type="spellStart"/>
+      <w:r>
+        <w:rPr>
+          <w:lang w:val="en-ID"/>
+        </w:rPr>
+        <w:t>Mengapa</w:t>
+      </w:r>
+      <w:proofErr w:type="spellEnd"/>
+      <w:r>
+        <w:rPr>
+          <w:lang w:val="en-ID"/>
+        </w:rPr>
+        <w:t xml:space="preserve"> </w:t>
+      </w:r>
+      <w:proofErr w:type="spellStart"/>
+      <w:r>
+        <w:rPr>
+          <w:lang w:val="en-ID"/>
+        </w:rPr>
+        <w:t>perlu</w:t>
+      </w:r>
+      <w:proofErr w:type="spellEnd"/>
+      <w:r>
+        <w:rPr>
+          <w:lang w:val="en-ID"/>
+        </w:rPr>
+        <w:t xml:space="preserve"> </w:t>
+      </w:r>
+      <w:proofErr w:type="spellStart"/>
+      <w:r>
+        <w:rPr>
+          <w:lang w:val="en-ID"/>
+        </w:rPr>
+        <w:t>validasi</w:t>
+      </w:r>
+      <w:proofErr w:type="spellEnd"/>
+      <w:r>
+        <w:rPr>
+          <w:lang w:val="en-ID"/>
+        </w:rPr>
+        <w:t xml:space="preserve"> method POST?</w:t>
+      </w:r>
+    </w:p>
+    <w:p>
+      <w:pPr>
+        <w:rPr>
+          <w:u w:val="single"/>
+          <w:lang w:val="en-ID"/>
+        </w:rPr>
+      </w:pPr>
+      <w:proofErr w:type="spellStart"/>
+      <w:r>
+        <w:rPr>
+          <w:u w:val="single"/>
+        </w:rPr>
+        <w:t>Untuk</w:t>
+      </w:r>
+      <w:proofErr w:type="spellEnd"/>
+      <w:r>
+        <w:rPr>
+          <w:u w:val="single"/>
+        </w:rPr>
+        <w:t xml:space="preserve"> </w:t>
+      </w:r>
+      <w:proofErr w:type="spellStart"/>
+      <w:r>
+        <w:rPr>
+          <w:u w:val="single"/>
+        </w:rPr>
+        <w:t>memastikan</w:t>
+      </w:r>
+      <w:proofErr w:type="spellEnd"/>
+      <w:r>
+        <w:rPr>
+          <w:u w:val="single"/>
+        </w:rPr>
+        <w:t xml:space="preserve"> API </w:t>
+      </w:r>
+      <w:proofErr w:type="spellStart"/>
+      <w:r>
+        <w:rPr>
+          <w:u w:val="single"/>
+        </w:rPr>
+        <w:t>hanya</w:t>
+      </w:r>
+      <w:proofErr w:type="spellEnd"/>
+      <w:r>
+        <w:rPr>
+          <w:u w:val="single"/>
+        </w:rPr>
+        <w:t xml:space="preserve"> </w:t>
+      </w:r>
+      <w:proofErr w:type="spellStart"/>
+      <w:r>
+        <w:rPr>
+          <w:u w:val="single"/>
+        </w:rPr>
+        <w:t>menerima</w:t>
+      </w:r>
+      <w:proofErr w:type="spellEnd"/>
+      <w:r>
+        <w:rPr>
+          <w:u w:val="single"/>
+        </w:rPr>
+        <w:t xml:space="preserve"> request yang </w:t>
+      </w:r>
+      <w:proofErr w:type="spellStart"/>
+      <w:r>
+        <w:rPr>
+          <w:u w:val="single"/>
+        </w:rPr>
+        <w:t>sesuai</w:t>
+      </w:r>
+      <w:proofErr w:type="spellEnd"/>
+      <w:r>
+        <w:rPr>
+          <w:u w:val="single"/>
+        </w:rPr>
+        <w:t xml:space="preserve"> dan </w:t>
+      </w:r>
+      <w:proofErr w:type="spellStart"/>
+      <w:r>
+        <w:rPr>
+          <w:u w:val="single"/>
+        </w:rPr>
+        <w:t>mencegah</w:t>
+      </w:r>
+      <w:proofErr w:type="spellEnd"/>
+      <w:r>
+        <w:rPr>
+          <w:u w:val="single"/>
+        </w:rPr>
+        <w:t xml:space="preserve"> </w:t>
+      </w:r>
+      <w:proofErr w:type="spellStart"/>
+      <w:r>
+        <w:rPr>
+          <w:u w:val="single"/>
+        </w:rPr>
+        <w:t>perubahan</w:t>
+      </w:r>
+      <w:proofErr w:type="spellEnd"/>
+      <w:r>
+        <w:rPr>
+          <w:u w:val="single"/>
+        </w:rPr>
+        <w:t xml:space="preserve"> data </w:t>
+      </w:r>
+      <w:proofErr w:type="spellStart"/>
+      <w:r>
+        <w:rPr>
+          <w:u w:val="single"/>
+        </w:rPr>
+        <w:t>lewat</w:t>
+      </w:r>
+      <w:proofErr w:type="spellEnd"/>
+      <w:r>
+        <w:rPr>
+          <w:u w:val="single"/>
+        </w:rPr>
+        <w:t xml:space="preserve"> method lain.</w:t>
+      </w:r>
+    </w:p>
+    <w:p>
+      <w:pPr>
+        <w:rPr>
+          <w:lang w:val="en-ID"/>
+        </w:rPr>
+      </w:pPr>
+      <w:r>
+        <w:rPr>
+          <w:lang w:val="en-ID"/>
+        </w:rPr>
+        <w:t xml:space="preserve">4. Apa </w:t>
+      </w:r>
+      <w:proofErr w:type="spellStart"/>
+      <w:r>
+        <w:rPr>
+          <w:lang w:val="en-ID"/>
+        </w:rPr>
+        <w:t>risiko</w:t>
+      </w:r>
+      <w:proofErr w:type="spellEnd"/>
+      <w:r>
+        <w:rPr>
+          <w:lang w:val="en-ID"/>
+        </w:rPr>
+        <w:t xml:space="preserve"> </w:t>
+      </w:r>
+      <w:proofErr w:type="spellStart"/>
+      <w:r>
+        <w:rPr>
+          <w:lang w:val="en-ID"/>
+        </w:rPr>
+        <w:t>jika</w:t>
+      </w:r>
+      <w:proofErr w:type="spellEnd"/>
+      <w:r>
+        <w:rPr>
+          <w:lang w:val="en-ID"/>
+        </w:rPr>
+        <w:t xml:space="preserve"> email </w:t>
+      </w:r>
+      <w:proofErr w:type="spellStart"/>
+      <w:r>
+        <w:rPr>
+          <w:lang w:val="en-ID"/>
+        </w:rPr>
+        <w:t>tidak</w:t>
+      </w:r>
+      <w:proofErr w:type="spellEnd"/>
+      <w:r>
+        <w:rPr>
+          <w:lang w:val="en-ID"/>
+        </w:rPr>
+        <w:t xml:space="preserve"> </w:t>
+      </w:r>
+      <w:proofErr w:type="spellStart"/>
+      <w:r>
+        <w:rPr>
+          <w:lang w:val="en-ID"/>
+        </w:rPr>
+        <w:t>dicek</w:t>
+      </w:r>
+      <w:proofErr w:type="spellEnd"/>
+      <w:r>
+        <w:rPr>
+          <w:lang w:val="en-ID"/>
+        </w:rPr>
+        <w:t xml:space="preserve"> </w:t>
+      </w:r>
+      <w:proofErr w:type="spellStart"/>
+      <w:r>
+        <w:rPr>
+          <w:lang w:val="en-ID"/>
+        </w:rPr>
+        <w:t>unik</w:t>
+      </w:r>
+      <w:proofErr w:type="spellEnd"/>
+      <w:r>
+        <w:rPr>
+          <w:lang w:val="en-ID"/>
+        </w:rPr>
+        <w:t>?</w:t>
+      </w:r>
+    </w:p>
+    <w:p>
+      <w:pPr>
+        <w:rPr>
+          <w:u w:val="single"/>
+          <w:lang w:val="en-ID"/>
+        </w:rPr>
+      </w:pPr>
+      <w:r>
+        <w:rPr>
+          <w:u w:val="single"/>
+          <w:lang w:val="en-ID"/>
+        </w:rPr>
+        <w:t xml:space="preserve">Bisa </w:t>
+      </w:r>
+      <w:proofErr w:type="spellStart"/>
+      <w:r>
+        <w:rPr>
+          <w:u w:val="single"/>
+          <w:lang w:val="en-ID"/>
+        </w:rPr>
+        <w:t>terjadi</w:t>
+      </w:r>
+      <w:proofErr w:type="spellEnd"/>
+      <w:r>
+        <w:rPr>
+          <w:u w:val="single"/>
+          <w:lang w:val="en-ID"/>
+        </w:rPr>
+        <w:t xml:space="preserve"> </w:t>
+      </w:r>
+      <w:proofErr w:type="spellStart"/>
+      <w:r>
+        <w:rPr>
+          <w:u w:val="single"/>
+          <w:lang w:val="en-ID"/>
+        </w:rPr>
+        <w:t>duplikasi</w:t>
+      </w:r>
+      <w:proofErr w:type="spellEnd"/>
+      <w:r>
+        <w:rPr>
+          <w:u w:val="single"/>
+          <w:lang w:val="en-ID"/>
+        </w:rPr>
+        <w:t xml:space="preserve"> </w:t>
+      </w:r>
+      <w:proofErr w:type="spellStart"/>
+      <w:r>
+        <w:rPr>
+          <w:u w:val="single"/>
+          <w:lang w:val="en-ID"/>
+        </w:rPr>
+        <w:t>akun</w:t>
+      </w:r>
+      <w:proofErr w:type="spellEnd"/>
+      <w:r>
+        <w:rPr>
+          <w:u w:val="single"/>
+          <w:lang w:val="en-ID"/>
+        </w:rPr>
+        <w:t xml:space="preserve">, </w:t>
+      </w:r>
+      <w:proofErr w:type="spellStart"/>
+      <w:r>
+        <w:rPr>
+          <w:u w:val="single"/>
+          <w:lang w:val="en-ID"/>
+        </w:rPr>
+        <w:t>kebingungan</w:t>
+      </w:r>
+      <w:proofErr w:type="spellEnd"/>
+      <w:r>
+        <w:rPr>
+          <w:u w:val="single"/>
+          <w:lang w:val="en-ID"/>
+        </w:rPr>
+        <w:t xml:space="preserve"> </w:t>
+      </w:r>
+      <w:proofErr w:type="spellStart"/>
+      <w:r>
+        <w:rPr>
+          <w:u w:val="single"/>
+          <w:lang w:val="en-ID"/>
+        </w:rPr>
+        <w:t>autentikasi</w:t>
+      </w:r>
+      <w:proofErr w:type="spellEnd"/>
+      <w:r>
+        <w:rPr>
+          <w:u w:val="single"/>
+          <w:lang w:val="en-ID"/>
+        </w:rPr>
+        <w:t xml:space="preserve">, dan </w:t>
+      </w:r>
+      <w:proofErr w:type="spellStart"/>
+      <w:r>
+        <w:rPr>
+          <w:u w:val="single"/>
+          <w:lang w:val="en-ID"/>
+        </w:rPr>
+        <w:t>potensi</w:t>
+      </w:r>
+      <w:proofErr w:type="spellEnd"/>
+      <w:r>
+        <w:rPr>
+          <w:u w:val="single"/>
+          <w:lang w:val="en-ID"/>
+        </w:rPr>
+        <w:t xml:space="preserve"> </w:t>
+      </w:r>
+      <w:proofErr w:type="spellStart"/>
+      <w:r>
+        <w:rPr>
+          <w:u w:val="single"/>
+          <w:lang w:val="en-ID"/>
+        </w:rPr>
+        <w:t>masalah</w:t>
+      </w:r>
+      <w:proofErr w:type="spellEnd"/>
+      <w:r>
+        <w:rPr>
+          <w:u w:val="single"/>
+          <w:lang w:val="en-ID"/>
+        </w:rPr>
+        <w:t xml:space="preserve"> </w:t>
+      </w:r>
+      <w:proofErr w:type="spellStart"/>
+      <w:r>
+        <w:rPr>
+          <w:u w:val="single"/>
+          <w:lang w:val="en-ID"/>
+        </w:rPr>
+        <w:t>keamanan</w:t>
+      </w:r>
+      <w:proofErr w:type="spellEnd"/>
+      <w:r>
+        <w:rPr>
+          <w:u w:val="single"/>
+          <w:lang w:val="en-ID"/>
+        </w:rPr>
+        <w:t>.</w:t>
+      </w:r>
+    </w:p>
+    <w:p>
+      <w:pPr>
+        <w:rPr>
+          <w:lang w:val="en-ID"/>
+        </w:rPr>
+      </w:pPr>
+      <w:r>
+        <w:rPr>
+          <w:lang w:val="en-ID"/>
+        </w:rPr>
+        <w:t xml:space="preserve">5. Apa </w:t>
+      </w:r>
+      <w:proofErr w:type="spellStart"/>
+      <w:r>
+        <w:rPr>
+          <w:lang w:val="en-ID"/>
+        </w:rPr>
+        <w:t>fungsi</w:t>
+      </w:r>
+      <w:proofErr w:type="spellEnd"/>
+      <w:r>
+        <w:rPr>
+          <w:lang w:val="en-ID"/>
+        </w:rPr>
+        <w:t xml:space="preserve"> role pada user?</w:t>
+      </w:r>
+    </w:p>
+    <w:p>
+      <w:pPr>
+        <w:rPr>
+          <w:u w:val="single"/>
+        </w:rPr>
+      </w:pPr>
+      <w:proofErr w:type="spellStart"/>
+      <w:r>
+        <w:rPr>
+          <w:u w:val="single"/>
+        </w:rPr>
+        <w:t>Menentukan</w:t>
+      </w:r>
+      <w:proofErr w:type="spellEnd"/>
+      <w:r>
+        <w:rPr>
+          <w:u w:val="single"/>
+        </w:rPr>
+        <w:t xml:space="preserve"> </w:t>
+      </w:r>
+      <w:proofErr w:type="spellStart"/>
+      <w:r>
+        <w:rPr>
+          <w:u w:val="single"/>
+        </w:rPr>
+        <w:t>hak</w:t>
+      </w:r>
+      <w:proofErr w:type="spellEnd"/>
+      <w:r>
+        <w:rPr>
+          <w:u w:val="single"/>
+        </w:rPr>
+        <w:t xml:space="preserve"> </w:t>
+      </w:r>
+      <w:proofErr w:type="spellStart"/>
+      <w:r>
+        <w:rPr>
+          <w:u w:val="single"/>
+        </w:rPr>
+        <w:t>akses</w:t>
+      </w:r>
+      <w:proofErr w:type="spellEnd"/>
+      <w:r>
+        <w:rPr>
+          <w:u w:val="single"/>
+        </w:rPr>
+        <w:t xml:space="preserve"> </w:t>
+      </w:r>
+      <w:proofErr w:type="spellStart"/>
+      <w:r>
+        <w:rPr>
+          <w:u w:val="single"/>
+        </w:rPr>
+        <w:t>atau</w:t>
+      </w:r>
+      <w:proofErr w:type="spellEnd"/>
+      <w:r>
+        <w:rPr>
+          <w:u w:val="single"/>
+        </w:rPr>
+        <w:t xml:space="preserve"> level </w:t>
+      </w:r>
+      <w:proofErr w:type="spellStart"/>
+      <w:r>
+        <w:rPr>
+          <w:u w:val="single"/>
+        </w:rPr>
+        <w:t>izin</w:t>
+      </w:r>
+      <w:proofErr w:type="spellEnd"/>
+      <w:r>
+        <w:rPr>
+          <w:u w:val="single"/>
+        </w:rPr>
+        <w:t xml:space="preserve"> user </w:t>
+      </w:r>
+      <w:proofErr w:type="spellStart"/>
+      <w:r>
+        <w:rPr>
+          <w:u w:val="single"/>
+        </w:rPr>
+        <w:t>dalam</w:t>
+      </w:r>
+      <w:proofErr w:type="spellEnd"/>
+      <w:r>
+        <w:rPr>
+          <w:u w:val="single"/>
+        </w:rPr>
+        <w:t xml:space="preserve"> </w:t>
+      </w:r>
+      <w:proofErr w:type="spellStart"/>
+      <w:r>
+        <w:rPr>
+          <w:u w:val="single"/>
+        </w:rPr>
+        <w:t>aplikasi</w:t>
+      </w:r>
+      <w:proofErr w:type="spellEnd"/>
+      <w:r>
+        <w:rPr>
+          <w:u w:val="single"/>
+        </w:rPr>
+        <w:t>.</w:t>
+      </w:r>
+    </w:p>
+    <w:p>
+      <w:pPr>
+        <w:pStyle w:val="Heading2"/>
+        <w:rPr>
+          <w:lang w:val="en-ID"/>
+        </w:rPr>
+      </w:pPr>
+      <w:r>
+        <w:rPr>
+          <w:lang w:val="en-ID"/>
+        </w:rPr>
+        <w:t xml:space="preserve">I. Output yang </w:t>
+      </w:r>
+      <w:proofErr w:type="spellStart"/>
+      <w:r>
+        <w:rPr>
+          <w:lang w:val="en-ID"/>
+        </w:rPr>
+        <w:t>Diharapkan</w:t>
+      </w:r>
+      <w:proofErr w:type="spellEnd"/>
+    </w:p>
+    <w:p>
+      <w:pPr>
+        <w:rPr>
+          <w:lang w:val="en-ID"/>
+        </w:rPr>
+      </w:pPr>
+      <w:proofErr w:type="spellStart"/>
+      <w:r>
+        <w:rPr>
+          <w:lang w:val="en-ID"/>
+        </w:rPr>
+        <w:t>Mahasiswa</w:t>
+      </w:r>
+      <w:proofErr w:type="spellEnd"/>
+      <w:r>
+        <w:rPr>
+          <w:lang w:val="en-ID"/>
+        </w:rPr>
+        <w:t xml:space="preserve"> </w:t>
+      </w:r>
+      <w:proofErr w:type="spellStart"/>
+      <w:r>
+        <w:rPr>
+          <w:lang w:val="en-ID"/>
+        </w:rPr>
+        <w:t>menghasilkan</w:t>
+      </w:r>
+      <w:proofErr w:type="spellEnd"/>
+      <w:r>
+        <w:rPr>
+          <w:lang w:val="en-ID"/>
+        </w:rPr>
+        <w:t>:</w:t>
+      </w:r>
+    </w:p>
+    <w:p>
+      <w:pPr>
+        <w:rPr>
+          <w:lang w:val="en-ID"/>
+        </w:rPr>
+      </w:pPr>
+      <w:r>
+        <w:rPr>
+          <w:rFonts w:ascii="Segoe UI Emoji" w:hAnsi="Segoe UI Emoji" w:cs="Segoe UI Emoji"/>
+          <w:lang w:val="en-ID"/>
+        </w:rPr>
+        <w:t>✅</w:t>
+      </w:r>
+      <w:r>
+        <w:rPr>
+          <w:rFonts w:ascii="Segoe UI Emoji" w:hAnsi="Segoe UI Emoji" w:cs="Segoe UI Emoji"/>
+          <w:lang w:val="en-ID"/>
+        </w:rPr>
+        <w:t xml:space="preserve"> </w:t>
+      </w:r>
+      <w:r>
+        <w:rPr>
+          <w:lang w:val="en-ID"/>
+        </w:rPr>
+        <w:t xml:space="preserve">Form </w:t>
+      </w:r>
+      <w:proofErr w:type="spellStart"/>
+      <w:r>
+        <w:rPr>
+          <w:lang w:val="en-ID"/>
+        </w:rPr>
+        <w:t>registrasi</w:t>
+      </w:r>
+      <w:proofErr w:type="spellEnd"/>
+      <w:r>
+        <w:rPr>
+          <w:lang w:val="en-ID"/>
+        </w:rPr>
+        <w:t xml:space="preserve"> </w:t>
+      </w:r>
+      <w:proofErr w:type="spellStart"/>
+      <w:r>
+        <w:rPr>
+          <w:lang w:val="en-ID"/>
+        </w:rPr>
+        <w:t>berfungsi</w:t>
+      </w:r>
+      <w:proofErr w:type="spellEnd"/>
+      <w:r>
+        <w:rPr>
+          <w:lang w:val="en-ID"/>
+        </w:rPr>
+        <w:t xml:space="preserve"> </w:t>
+      </w:r>
+    </w:p>
+    <w:p>
+      <w:pPr>
+        <w:rPr>
+          <w:lang w:val="en-ID"/>
+        </w:rPr>
+      </w:pPr>
+      <w:r>
+        <w:rPr>
+          <w:rFonts w:ascii="Segoe UI Emoji" w:hAnsi="Segoe UI Emoji" w:cs="Segoe UI Emoji"/>
+          <w:lang w:val="en-ID"/>
+        </w:rPr>
+        <w:t xml:space="preserve">✅ </w:t>
+      </w:r>
+      <w:r>
+        <w:rPr>
+          <w:lang w:val="en-ID"/>
+        </w:rPr>
+        <w:t xml:space="preserve">API POST </w:t>
+      </w:r>
+      <w:proofErr w:type="spellStart"/>
+      <w:r>
+        <w:rPr>
+          <w:lang w:val="en-ID"/>
+        </w:rPr>
+        <w:t>berjalan</w:t>
+      </w:r>
+      <w:proofErr w:type="spellEnd"/>
+      <w:r>
+        <w:rPr>
+          <w:lang w:val="en-ID"/>
+        </w:rPr>
+        <w:t xml:space="preserve"> </w:t>
+      </w:r>
+    </w:p>
+    <w:p>
+      <w:pPr>
+        <w:rPr>
+          <w:lang w:val="en-ID"/>
+        </w:rPr>
+      </w:pPr>
+      <w:r>
+        <w:rPr>
+          <w:rFonts w:ascii="Segoe UI Emoji" w:hAnsi="Segoe UI Emoji" w:cs="Segoe UI Emoji"/>
+          <w:lang w:val="en-ID"/>
+        </w:rPr>
+        <w:t xml:space="preserve">✅ </w:t>
+      </w:r>
+      <w:r>
+        <w:rPr>
+          <w:lang w:val="en-ID"/>
+        </w:rPr>
+        <w:t xml:space="preserve">Email </w:t>
+      </w:r>
+      <w:proofErr w:type="spellStart"/>
+      <w:r>
+        <w:rPr>
+          <w:lang w:val="en-ID"/>
+        </w:rPr>
+        <w:t>unik</w:t>
+      </w:r>
+      <w:proofErr w:type="spellEnd"/>
+      <w:r>
+        <w:rPr>
+          <w:lang w:val="en-ID"/>
+        </w:rPr>
+        <w:t xml:space="preserve"> </w:t>
+      </w:r>
+      <w:proofErr w:type="spellStart"/>
+      <w:r>
+        <w:rPr>
+          <w:lang w:val="en-ID"/>
+        </w:rPr>
+        <w:t>tervalidasi</w:t>
+      </w:r>
+      <w:proofErr w:type="spellEnd"/>
+      <w:r>
+        <w:rPr>
+          <w:lang w:val="en-ID"/>
+        </w:rPr>
+        <w:t xml:space="preserve"> </w:t>
+      </w:r>
+    </w:p>
+    <w:p>
+      <w:pPr>
+        <w:rPr>
+          <w:lang w:val="en-ID"/>
+        </w:rPr>
+      </w:pPr>
+      <w:r>
+        <w:rPr>
+          <w:rFonts w:ascii="Segoe UI Emoji" w:hAnsi="Segoe UI Emoji" w:cs="Segoe UI Emoji"/>
+          <w:lang w:val="en-ID"/>
+        </w:rPr>
+        <w:t xml:space="preserve">✅ </w:t>
+      </w:r>
+      <w:r>
+        <w:rPr>
+          <w:lang w:val="en-ID"/>
+        </w:rPr>
+        <w:t xml:space="preserve">Password ter-hash </w:t>
+      </w:r>
+    </w:p>
+    <w:p>
+      <w:pPr>
+        <w:rPr>
+          <w:lang w:val="en-ID"/>
+        </w:rPr>
+      </w:pPr>
+      <w:r>
+        <w:rPr>
+          <w:rFonts w:ascii="Segoe UI Emoji" w:hAnsi="Segoe UI Emoji" w:cs="Segoe UI Emoji"/>
+          <w:lang w:val="en-ID"/>
+        </w:rPr>
+        <w:t xml:space="preserve">✅ </w:t>
+      </w:r>
+      <w:r>
+        <w:rPr>
+          <w:lang w:val="en-ID"/>
+        </w:rPr>
+        <w:t xml:space="preserve">Data </w:t>
+      </w:r>
+      <w:proofErr w:type="spellStart"/>
+      <w:r>
+        <w:rPr>
+          <w:lang w:val="en-ID"/>
+        </w:rPr>
+        <w:t>tersimpan</w:t>
+      </w:r>
+      <w:proofErr w:type="spellEnd"/>
+      <w:r>
+        <w:rPr>
+          <w:lang w:val="en-ID"/>
+        </w:rPr>
+        <w:t xml:space="preserve"> di </w:t>
+      </w:r>
+      <w:proofErr w:type="spellStart"/>
+      <w:r>
+        <w:rPr>
+          <w:lang w:val="en-ID"/>
+        </w:rPr>
+        <w:t>Firestore</w:t>
+      </w:r>
+      <w:proofErr w:type="spellEnd"/>
+      <w:r>
+        <w:rPr>
+          <w:lang w:val="en-ID"/>
+        </w:rPr>
+        <w:t xml:space="preserve"> </w:t>
+      </w:r>
+    </w:p>
+    <w:p>
+      <w:pPr>
+        <w:rPr>
+          <w:lang w:val="en-ID"/>
+        </w:rPr>
+      </w:pPr>
+      <w:r>
+        <w:rPr>
+          <w:rFonts w:ascii="Segoe UI Emoji" w:hAnsi="Segoe UI Emoji" w:cs="Segoe UI Emoji"/>
+          <w:lang w:val="en-ID"/>
+        </w:rPr>
+        <w:t xml:space="preserve">✅ </w:t>
+      </w:r>
+      <w:r>
+        <w:rPr>
+          <w:lang w:val="en-ID"/>
+        </w:rPr>
+        <w:t xml:space="preserve">Error </w:t>
+      </w:r>
+      <w:proofErr w:type="spellStart"/>
+      <w:r>
+        <w:rPr>
+          <w:lang w:val="en-ID"/>
+        </w:rPr>
+        <w:t>tampil</w:t>
+      </w:r>
+      <w:proofErr w:type="spellEnd"/>
+      <w:r>
+        <w:rPr>
+          <w:lang w:val="en-ID"/>
+        </w:rPr>
+        <w:t xml:space="preserve"> di UI </w:t>
+      </w:r>
+    </w:p>
+    <w:p>
+      <w:r>
+        <w:rPr>
+          <w:rFonts w:ascii="Segoe UI Emoji" w:hAnsi="Segoe UI Emoji" w:cs="Segoe UI Emoji"/>
+          <w:lang w:val="en-ID"/>
+        </w:rPr>
+        <w:t xml:space="preserve">✅ </w:t>
+      </w:r>
+      <w:r>
+        <w:rPr>
+          <w:lang w:val="en-ID"/>
+        </w:rPr>
+        <w:t xml:space="preserve">Redirect </w:t>
+      </w:r>
+      <w:proofErr w:type="spellStart"/>
+      <w:r>
+        <w:rPr>
+          <w:lang w:val="en-ID"/>
+        </w:rPr>
+        <w:t>ke</w:t>
+      </w:r>
+      <w:proofErr w:type="spellEnd"/>
+      <w:r>
+        <w:rPr>
+          <w:lang w:val="en-ID"/>
+        </w:rPr>
+        <w:t xml:space="preserve"> login</w:t>
+      </w:r>
+    </w:p>
     <w:p/>
-    <w:p/>
-    <w:p>
-      <w:r>
+    <w:p>
+      <w:r>
+        <w:lastRenderedPageBreak/>
         <w:br w:type="page"/>
       </w:r>
     </w:p>

</xml_diff>

<commit_message>
Jobsheet 16: BAGIAN 1 – Custom Login Page
</commit_message>
<xml_diff>
--- a/Laporan/03_Ahmad Dzul Fadhli Jobsheet 15,16&17.docx
+++ b/Laporan/03_Ahmad Dzul Fadhli Jobsheet 15,16&17.docx
@@ -6643,11 +6643,286 @@
     </w:p>
     <w:p>
       <w:pPr>
-        <w:jc w:val="left"/>
-        <w:rPr>
-          <w:rFonts w:eastAsiaTheme="majorEastAsia" w:cstheme="majorBidi"/>
-          <w:b/>
-          <w:caps/>
+        <w:pStyle w:val="Heading2"/>
+      </w:pPr>
+      <w:r>
+        <w:t xml:space="preserve">C. Langkah </w:t>
+      </w:r>
+      <w:proofErr w:type="spellStart"/>
+      <w:r>
+        <w:t>Praktikum</w:t>
+      </w:r>
+      <w:proofErr w:type="spellEnd"/>
+      <w:r>
+        <w:t xml:space="preserve"> </w:t>
+      </w:r>
+    </w:p>
+    <w:p>
+      <w:pPr>
+        <w:pStyle w:val="Heading3"/>
+      </w:pPr>
+      <w:r>
+        <w:t>BAGIAN 1 – Custom Login P</w:t>
+      </w:r>
+      <w:r>
+        <w:t>age</w:t>
+      </w:r>
+    </w:p>
+    <w:p>
+      <w:proofErr w:type="spellStart"/>
+      <w:r>
+        <w:t>Tambahkan</w:t>
+      </w:r>
+      <w:proofErr w:type="spellEnd"/>
+      <w:r>
+        <w:t xml:space="preserve"> custom page di </w:t>
+      </w:r>
+      <w:proofErr w:type="spellStart"/>
+      <w:r>
+        <w:t>NextAuth</w:t>
+      </w:r>
+      <w:proofErr w:type="spellEnd"/>
+      <w:r>
+        <w:t xml:space="preserve"> line 55-57 </w:t>
+      </w:r>
+    </w:p>
+    <w:p>
+      <w:r>
+        <w:drawing>
+          <wp:inline distT="0" distB="0" distL="0" distR="0" wp14:anchorId="4F78C687" wp14:editId="0DFDCE1A">
+            <wp:extent cx="2880000" cy="869846"/>
+            <wp:effectExtent l="0" t="0" r="0" b="6985"/>
+            <wp:docPr id="658034036" name="Picture 1"/>
+            <wp:cNvGraphicFramePr>
+              <a:graphicFrameLocks xmlns:a="http://schemas.openxmlformats.org/drawingml/2006/main" noChangeAspect="1"/>
+            </wp:cNvGraphicFramePr>
+            <a:graphic xmlns:a="http://schemas.openxmlformats.org/drawingml/2006/main">
+              <a:graphicData uri="http://schemas.openxmlformats.org/drawingml/2006/picture">
+                <pic:pic xmlns:pic="http://schemas.openxmlformats.org/drawingml/2006/picture">
+                  <pic:nvPicPr>
+                    <pic:cNvPr id="658034036" name=""/>
+                    <pic:cNvPicPr/>
+                  </pic:nvPicPr>
+                  <pic:blipFill>
+                    <a:blip r:embed="rId45"/>
+                    <a:stretch>
+                      <a:fillRect/>
+                    </a:stretch>
+                  </pic:blipFill>
+                  <pic:spPr>
+                    <a:xfrm>
+                      <a:off x="0" y="0"/>
+                      <a:ext cx="2880000" cy="869846"/>
+                    </a:xfrm>
+                    <a:prstGeom prst="rect">
+                      <a:avLst/>
+                    </a:prstGeom>
+                  </pic:spPr>
+                </pic:pic>
+              </a:graphicData>
+            </a:graphic>
+          </wp:inline>
+        </w:drawing>
+      </w:r>
+    </w:p>
+    <w:p>
+      <w:pPr>
+        <w:rPr>
+          <w:lang w:val="en-ID"/>
+        </w:rPr>
+      </w:pPr>
+      <w:proofErr w:type="spellStart"/>
+      <w:r>
+        <w:rPr>
+          <w:lang w:val="en-ID"/>
+        </w:rPr>
+        <w:t>Jalankan</w:t>
+      </w:r>
+      <w:proofErr w:type="spellEnd"/>
+      <w:r>
+        <w:rPr>
+          <w:lang w:val="en-ID"/>
+        </w:rPr>
+        <w:t xml:space="preserve"> browser http://localhost:3000/ dan </w:t>
+      </w:r>
+      <w:proofErr w:type="spellStart"/>
+      <w:r>
+        <w:rPr>
+          <w:lang w:val="en-ID"/>
+        </w:rPr>
+        <w:t>klik</w:t>
+      </w:r>
+      <w:proofErr w:type="spellEnd"/>
+      <w:r>
+        <w:rPr>
+          <w:lang w:val="en-ID"/>
+        </w:rPr>
+        <w:t xml:space="preserve"> sign in </w:t>
+      </w:r>
+      <w:proofErr w:type="spellStart"/>
+      <w:r>
+        <w:rPr>
+          <w:lang w:val="en-ID"/>
+        </w:rPr>
+        <w:t>maka</w:t>
+      </w:r>
+      <w:proofErr w:type="spellEnd"/>
+      <w:r>
+        <w:rPr>
+          <w:lang w:val="en-ID"/>
+        </w:rPr>
+        <w:t xml:space="preserve"> </w:t>
+      </w:r>
+      <w:proofErr w:type="spellStart"/>
+      <w:r>
+        <w:rPr>
+          <w:lang w:val="en-ID"/>
+        </w:rPr>
+        <w:t>akan</w:t>
+      </w:r>
+      <w:proofErr w:type="spellEnd"/>
+      <w:r>
+        <w:rPr>
+          <w:lang w:val="en-ID"/>
+        </w:rPr>
+        <w:t xml:space="preserve"> </w:t>
+      </w:r>
+      <w:proofErr w:type="spellStart"/>
+      <w:r>
+        <w:rPr>
+          <w:lang w:val="en-ID"/>
+        </w:rPr>
+        <w:t>diarahkan</w:t>
+      </w:r>
+      <w:proofErr w:type="spellEnd"/>
+      <w:r>
+        <w:rPr>
+          <w:lang w:val="en-ID"/>
+        </w:rPr>
+        <w:t xml:space="preserve"> </w:t>
+      </w:r>
+      <w:proofErr w:type="spellStart"/>
+      <w:r>
+        <w:rPr>
+          <w:lang w:val="en-ID"/>
+        </w:rPr>
+        <w:t>ke</w:t>
+      </w:r>
+      <w:proofErr w:type="spellEnd"/>
+      <w:r>
+        <w:rPr>
+          <w:lang w:val="en-ID"/>
+        </w:rPr>
+        <w:t xml:space="preserve"> l</w:t>
+      </w:r>
+      <w:r>
+        <w:rPr>
+          <w:lang w:val="en-ID"/>
+        </w:rPr>
+        <w:t>ogin</w:t>
+      </w:r>
+    </w:p>
+    <w:p>
+      <w:r>
+        <w:drawing>
+          <wp:inline distT="0" distB="0" distL="0" distR="0" wp14:anchorId="36D0B7DE" wp14:editId="5CE7DA8A">
+            <wp:extent cx="2880000" cy="2072756"/>
+            <wp:effectExtent l="0" t="0" r="0" b="3810"/>
+            <wp:docPr id="726787792" name="Picture 1"/>
+            <wp:cNvGraphicFramePr>
+              <a:graphicFrameLocks xmlns:a="http://schemas.openxmlformats.org/drawingml/2006/main" noChangeAspect="1"/>
+            </wp:cNvGraphicFramePr>
+            <a:graphic xmlns:a="http://schemas.openxmlformats.org/drawingml/2006/main">
+              <a:graphicData uri="http://schemas.openxmlformats.org/drawingml/2006/picture">
+                <pic:pic xmlns:pic="http://schemas.openxmlformats.org/drawingml/2006/picture">
+                  <pic:nvPicPr>
+                    <pic:cNvPr id="726787792" name=""/>
+                    <pic:cNvPicPr/>
+                  </pic:nvPicPr>
+                  <pic:blipFill rotWithShape="1">
+                    <a:blip r:embed="rId46"/>
+                    <a:srcRect b="16034"/>
+                    <a:stretch>
+                      <a:fillRect/>
+                    </a:stretch>
+                  </pic:blipFill>
+                  <pic:spPr bwMode="auto">
+                    <a:xfrm>
+                      <a:off x="0" y="0"/>
+                      <a:ext cx="2880000" cy="2072756"/>
+                    </a:xfrm>
+                    <a:prstGeom prst="rect">
+                      <a:avLst/>
+                    </a:prstGeom>
+                    <a:ln>
+                      <a:noFill/>
+                    </a:ln>
+                    <a:extLst>
+                      <a:ext uri="{53640926-AAD7-44D8-BBD7-CCE9431645EC}">
+                        <a14:shadowObscured xmlns:a14="http://schemas.microsoft.com/office/drawing/2010/main"/>
+                      </a:ext>
+                    </a:extLst>
+                  </pic:spPr>
+                </pic:pic>
+              </a:graphicData>
+            </a:graphic>
+          </wp:inline>
+        </w:drawing>
+      </w:r>
+    </w:p>
+    <w:p>
+      <w:r>
+        <w:drawing>
+          <wp:inline distT="0" distB="0" distL="0" distR="0" wp14:anchorId="29897D4E" wp14:editId="4229B3FE">
+            <wp:extent cx="2880000" cy="1866462"/>
+            <wp:effectExtent l="0" t="0" r="0" b="635"/>
+            <wp:docPr id="1026748348" name="Picture 1"/>
+            <wp:cNvGraphicFramePr>
+              <a:graphicFrameLocks xmlns:a="http://schemas.openxmlformats.org/drawingml/2006/main" noChangeAspect="1"/>
+            </wp:cNvGraphicFramePr>
+            <a:graphic xmlns:a="http://schemas.openxmlformats.org/drawingml/2006/main">
+              <a:graphicData uri="http://schemas.openxmlformats.org/drawingml/2006/picture">
+                <pic:pic xmlns:pic="http://schemas.openxmlformats.org/drawingml/2006/picture">
+                  <pic:nvPicPr>
+                    <pic:cNvPr id="1026748348" name=""/>
+                    <pic:cNvPicPr/>
+                  </pic:nvPicPr>
+                  <pic:blipFill>
+                    <a:blip r:embed="rId47"/>
+                    <a:stretch>
+                      <a:fillRect/>
+                    </a:stretch>
+                  </pic:blipFill>
+                  <pic:spPr>
+                    <a:xfrm>
+                      <a:off x="0" y="0"/>
+                      <a:ext cx="2880000" cy="1866462"/>
+                    </a:xfrm>
+                    <a:prstGeom prst="rect">
+                      <a:avLst/>
+                    </a:prstGeom>
+                  </pic:spPr>
+                </pic:pic>
+              </a:graphicData>
+            </a:graphic>
+          </wp:inline>
+        </w:drawing>
+      </w:r>
+    </w:p>
+    <w:p>
+      <w:r>
+        <w:t>Benar</w:t>
+      </w:r>
+    </w:p>
+    <w:p/>
+    <w:p/>
+    <w:p/>
+    <w:p/>
+    <w:p/>
+    <w:p/>
+    <w:p>
+      <w:pPr>
+        <w:rPr>
           <w:szCs w:val="40"/>
         </w:rPr>
       </w:pPr>
@@ -7675,11 +7950,12 @@
     <w:link w:val="Heading1Char"/>
     <w:uiPriority w:val="9"/>
     <w:qFormat/>
-    <w:rsid w:val="00D75B88"/>
+    <w:rsid w:val="007158C6"/>
     <w:pPr>
       <w:keepNext/>
       <w:keepLines/>
       <w:spacing w:before="360" w:after="80"/>
+      <w:jc w:val="left"/>
       <w:outlineLvl w:val="0"/>
     </w:pPr>
     <w:rPr>
@@ -7894,7 +8170,7 @@
     <w:basedOn w:val="DefaultParagraphFont"/>
     <w:link w:val="Heading1"/>
     <w:uiPriority w:val="9"/>
-    <w:rsid w:val="00D75B88"/>
+    <w:rsid w:val="007158C6"/>
     <w:rPr>
       <w:rFonts w:eastAsiaTheme="majorEastAsia" w:cstheme="majorBidi"/>
       <w:b/>

</xml_diff>